<commit_message>
APC 0712312-91: complemento da revisão a partir dos autos
Co-Authored-By: Claude Sonnet 5.5 <noreply@anthropic.com>
Claude-Session: https://claude.ai/code/session_01TWDXEzUJTq4wT25j32sZ1d
</commit_message>
<xml_diff>
--- a/entregas-0712312/9 APC 0712312-91 ACA Marcos DP inexigibilidade do débito de água obrigação pessoal ausência de prova.docx
+++ b/entregas-0712312/9 APC 0712312-91 ACA Marcos DP inexigibilidade do débito de água obrigação pessoal ausência de prova.docx
@@ -4551,7 +4551,24 @@
           <w:sz w:val="28"/>
           <w:szCs w:val="28"/>
         </w:rPr>
-        <w:t xml:space="preserve">1.997 do Código Civil;</w:t>
+        <w:t xml:space="preserve">1.997 do Código Civil</w:t>
+      </w:r>
+      <w:r>
+        <w:rPr>
+          <w:rFonts w:ascii="Arial" w:hAnsi="Arial" w:eastAsia="Arial" w:cs="Arial"/>
+          <w:color w:val="808080"/>
+          <w:sz w:val="28"/>
+          <w:szCs w:val="28"/>
+        </w:rPr>
+        <w:t xml:space="preserve">, e a jurisprudência do TJSP e do STJ veda a cobrança direta de herdeiros ou novos possuidores</w:t>
+      </w:r>
+      <w:r>
+        <w:rPr>
+          <w:rFonts w:ascii="Arial" w:hAnsi="Arial" w:eastAsia="Arial" w:cs="Arial"/>
+          <w:sz w:val="28"/>
+          <w:szCs w:val="28"/>
+        </w:rPr>
+        <w:t xml:space="preserve">;</w:t>
       </w:r>
       <w:r>
         <w:rPr>
@@ -4585,7 +4602,271 @@
           <w:sz w:val="28"/>
           <w:szCs w:val="28"/>
         </w:rPr>
-        <w:t xml:space="preserve">não se aplica, à hipótese, a vedação ao enriquecimento sem causa, porque a cobrança foi direcionada à autora sem demonstração de sua responsabilidade pelo débito</w:t>
+        <w:t xml:space="preserve">a </w:t>
+      </w:r>
+      <w:r>
+        <w:rPr>
+          <w:rFonts w:ascii="Arial" w:hAnsi="Arial" w:eastAsia="Arial" w:cs="Arial"/>
+          <w:color w:val="808080"/>
+          <w:sz w:val="28"/>
+          <w:szCs w:val="28"/>
+        </w:rPr>
+        <w:t xml:space="preserve">tese</w:t>
+      </w:r>
+      <w:r>
+        <w:rPr>
+          <w:rFonts w:ascii="Arial" w:hAnsi="Arial" w:eastAsia="Arial" w:cs="Arial"/>
+          <w:sz w:val="28"/>
+          <w:szCs w:val="28"/>
+        </w:rPr>
+        <w:t xml:space="preserve"> </w:t>
+      </w:r>
+      <w:r>
+        <w:rPr>
+          <w:rFonts w:ascii="Arial" w:hAnsi="Arial" w:eastAsia="Arial" w:cs="Arial"/>
+          <w:color w:val="808080"/>
+          <w:sz w:val="28"/>
+          <w:szCs w:val="28"/>
+        </w:rPr>
+        <w:t xml:space="preserve">do</w:t>
+      </w:r>
+      <w:r>
+        <w:rPr>
+          <w:rFonts w:ascii="Arial" w:hAnsi="Arial" w:eastAsia="Arial" w:cs="Arial"/>
+          <w:sz w:val="28"/>
+          <w:szCs w:val="28"/>
+        </w:rPr>
+        <w:t xml:space="preserve"> enriquecimento sem causa</w:t>
+      </w:r>
+      <w:r>
+        <w:rPr>
+          <w:rFonts w:ascii="Arial" w:hAnsi="Arial" w:eastAsia="Arial" w:cs="Arial"/>
+          <w:color w:val="808080"/>
+          <w:sz w:val="28"/>
+          <w:szCs w:val="28"/>
+        </w:rPr>
+        <w:t xml:space="preserve"> deve ser rechaçada</w:t>
+      </w:r>
+      <w:r>
+        <w:rPr>
+          <w:rFonts w:ascii="Arial" w:hAnsi="Arial" w:eastAsia="Arial" w:cs="Arial"/>
+          <w:sz w:val="28"/>
+          <w:szCs w:val="28"/>
+        </w:rPr>
+        <w:t xml:space="preserve">, </w:t>
+      </w:r>
+      <w:r>
+        <w:rPr>
+          <w:rFonts w:ascii="Arial" w:hAnsi="Arial" w:eastAsia="Arial" w:cs="Arial"/>
+          <w:color w:val="808080"/>
+          <w:sz w:val="28"/>
+          <w:szCs w:val="28"/>
+        </w:rPr>
+        <w:t xml:space="preserve">pois</w:t>
+      </w:r>
+      <w:r>
+        <w:rPr>
+          <w:rFonts w:ascii="Arial" w:hAnsi="Arial" w:eastAsia="Arial" w:cs="Arial"/>
+          <w:sz w:val="28"/>
+          <w:szCs w:val="28"/>
+        </w:rPr>
+        <w:t xml:space="preserve"> </w:t>
+      </w:r>
+      <w:r>
+        <w:rPr>
+          <w:rFonts w:ascii="Arial" w:hAnsi="Arial" w:eastAsia="Arial" w:cs="Arial"/>
+          <w:color w:val="808080"/>
+          <w:sz w:val="28"/>
+          <w:szCs w:val="28"/>
+        </w:rPr>
+        <w:t xml:space="preserve">o</w:t>
+      </w:r>
+      <w:r>
+        <w:rPr>
+          <w:rFonts w:ascii="Arial" w:hAnsi="Arial" w:eastAsia="Arial" w:cs="Arial"/>
+          <w:sz w:val="28"/>
+          <w:szCs w:val="28"/>
+        </w:rPr>
+        <w:t xml:space="preserve"> </w:t>
+      </w:r>
+      <w:r>
+        <w:rPr>
+          <w:rFonts w:ascii="Arial" w:hAnsi="Arial" w:eastAsia="Arial" w:cs="Arial"/>
+          <w:color w:val="808080"/>
+          <w:sz w:val="28"/>
+          <w:szCs w:val="28"/>
+        </w:rPr>
+        <w:t xml:space="preserve">enriquecimento</w:t>
+      </w:r>
+      <w:r>
+        <w:rPr>
+          <w:rFonts w:ascii="Arial" w:hAnsi="Arial" w:eastAsia="Arial" w:cs="Arial"/>
+          <w:sz w:val="28"/>
+          <w:szCs w:val="28"/>
+        </w:rPr>
+        <w:t xml:space="preserve"> </w:t>
+      </w:r>
+      <w:r>
+        <w:rPr>
+          <w:rFonts w:ascii="Arial" w:hAnsi="Arial" w:eastAsia="Arial" w:cs="Arial"/>
+          <w:color w:val="808080"/>
+          <w:sz w:val="28"/>
+          <w:szCs w:val="28"/>
+        </w:rPr>
+        <w:t xml:space="preserve">ilícito</w:t>
+      </w:r>
+      <w:r>
+        <w:rPr>
+          <w:rFonts w:ascii="Arial" w:hAnsi="Arial" w:eastAsia="Arial" w:cs="Arial"/>
+          <w:sz w:val="28"/>
+          <w:szCs w:val="28"/>
+        </w:rPr>
+        <w:t xml:space="preserve"> </w:t>
+      </w:r>
+      <w:r>
+        <w:rPr>
+          <w:rFonts w:ascii="Arial" w:hAnsi="Arial" w:eastAsia="Arial" w:cs="Arial"/>
+          <w:color w:val="808080"/>
+          <w:sz w:val="28"/>
+          <w:szCs w:val="28"/>
+        </w:rPr>
+        <w:t xml:space="preserve">seria</w:t>
+      </w:r>
+      <w:r>
+        <w:rPr>
+          <w:rFonts w:ascii="Arial" w:hAnsi="Arial" w:eastAsia="Arial" w:cs="Arial"/>
+          <w:sz w:val="28"/>
+          <w:szCs w:val="28"/>
+        </w:rPr>
+        <w:t xml:space="preserve"> </w:t>
+      </w:r>
+      <w:r>
+        <w:rPr>
+          <w:rFonts w:ascii="Arial" w:hAnsi="Arial" w:eastAsia="Arial" w:cs="Arial"/>
+          <w:color w:val="808080"/>
+          <w:sz w:val="28"/>
+          <w:szCs w:val="28"/>
+        </w:rPr>
+        <w:t xml:space="preserve">da</w:t>
+      </w:r>
+      <w:r>
+        <w:rPr>
+          <w:rFonts w:ascii="Arial" w:hAnsi="Arial" w:eastAsia="Arial" w:cs="Arial"/>
+          <w:sz w:val="28"/>
+          <w:szCs w:val="28"/>
+        </w:rPr>
+        <w:t xml:space="preserve"> </w:t>
+      </w:r>
+      <w:r>
+        <w:rPr>
+          <w:rFonts w:ascii="Arial" w:hAnsi="Arial" w:eastAsia="Arial" w:cs="Arial"/>
+          <w:color w:val="808080"/>
+          <w:sz w:val="28"/>
+          <w:szCs w:val="28"/>
+        </w:rPr>
+        <w:t xml:space="preserve">concessionária,</w:t>
+      </w:r>
+      <w:r>
+        <w:rPr>
+          <w:rFonts w:ascii="Arial" w:hAnsi="Arial" w:eastAsia="Arial" w:cs="Arial"/>
+          <w:sz w:val="28"/>
+          <w:szCs w:val="28"/>
+        </w:rPr>
+        <w:t xml:space="preserve"> </w:t>
+      </w:r>
+      <w:r>
+        <w:rPr>
+          <w:rFonts w:ascii="Arial" w:hAnsi="Arial" w:eastAsia="Arial" w:cs="Arial"/>
+          <w:color w:val="808080"/>
+          <w:sz w:val="28"/>
+          <w:szCs w:val="28"/>
+        </w:rPr>
+        <w:t xml:space="preserve">que</w:t>
+      </w:r>
+      <w:r>
+        <w:rPr>
+          <w:rFonts w:ascii="Arial" w:hAnsi="Arial" w:eastAsia="Arial" w:cs="Arial"/>
+          <w:sz w:val="28"/>
+          <w:szCs w:val="28"/>
+        </w:rPr>
+        <w:t xml:space="preserve"> </w:t>
+      </w:r>
+      <w:r>
+        <w:rPr>
+          <w:rFonts w:ascii="Arial" w:hAnsi="Arial" w:eastAsia="Arial" w:cs="Arial"/>
+          <w:color w:val="808080"/>
+          <w:sz w:val="28"/>
+          <w:szCs w:val="28"/>
+        </w:rPr>
+        <w:t xml:space="preserve">cobra da apelante dívida do espólio em vez</w:t>
+      </w:r>
+      <w:r>
+        <w:rPr>
+          <w:rFonts w:ascii="Arial" w:hAnsi="Arial" w:eastAsia="Arial" w:cs="Arial"/>
+          <w:sz w:val="28"/>
+          <w:szCs w:val="28"/>
+        </w:rPr>
+        <w:t xml:space="preserve"> de </w:t>
+      </w:r>
+      <w:r>
+        <w:rPr>
+          <w:rFonts w:ascii="Arial" w:hAnsi="Arial" w:eastAsia="Arial" w:cs="Arial"/>
+          <w:color w:val="808080"/>
+          <w:sz w:val="28"/>
+          <w:szCs w:val="28"/>
+        </w:rPr>
+        <w:t xml:space="preserve">adotar</w:t>
+      </w:r>
+      <w:r>
+        <w:rPr>
+          <w:rFonts w:ascii="Arial" w:hAnsi="Arial" w:eastAsia="Arial" w:cs="Arial"/>
+          <w:sz w:val="28"/>
+          <w:szCs w:val="28"/>
+        </w:rPr>
+        <w:t xml:space="preserve"> </w:t>
+      </w:r>
+      <w:r>
+        <w:rPr>
+          <w:rFonts w:ascii="Arial" w:hAnsi="Arial" w:eastAsia="Arial" w:cs="Arial"/>
+          <w:color w:val="808080"/>
+          <w:sz w:val="28"/>
+          <w:szCs w:val="28"/>
+        </w:rPr>
+        <w:t xml:space="preserve">os</w:t>
+      </w:r>
+      <w:r>
+        <w:rPr>
+          <w:rFonts w:ascii="Arial" w:hAnsi="Arial" w:eastAsia="Arial" w:cs="Arial"/>
+          <w:sz w:val="28"/>
+          <w:szCs w:val="28"/>
+        </w:rPr>
+        <w:t xml:space="preserve"> </w:t>
+      </w:r>
+      <w:r>
+        <w:rPr>
+          <w:rFonts w:ascii="Arial" w:hAnsi="Arial" w:eastAsia="Arial" w:cs="Arial"/>
+          <w:color w:val="808080"/>
+          <w:sz w:val="28"/>
+          <w:szCs w:val="28"/>
+        </w:rPr>
+        <w:t xml:space="preserve">procedimentos</w:t>
+      </w:r>
+      <w:r>
+        <w:rPr>
+          <w:rFonts w:ascii="Arial" w:hAnsi="Arial" w:eastAsia="Arial" w:cs="Arial"/>
+          <w:sz w:val="28"/>
+          <w:szCs w:val="28"/>
+        </w:rPr>
+        <w:t xml:space="preserve"> </w:t>
+      </w:r>
+      <w:r>
+        <w:rPr>
+          <w:rFonts w:ascii="Arial" w:hAnsi="Arial" w:eastAsia="Arial" w:cs="Arial"/>
+          <w:color w:val="808080"/>
+          <w:sz w:val="28"/>
+          <w:szCs w:val="28"/>
+        </w:rPr>
+        <w:t xml:space="preserve">corretos de cobrança</w:t>
       </w:r>
       <w:r>
         <w:rPr>
@@ -4689,39 +4970,100 @@
           <w:sz w:val="28"/>
           <w:szCs w:val="28"/>
         </w:rPr>
-        <w:t xml:space="preserve">Requer a reforma </w:t>
-      </w:r>
-      <w:r>
-        <w:rPr>
-          <w:rFonts w:ascii="Arial" w:hAnsi="Arial" w:cs="Arial"/>
-          <w:sz w:val="28"/>
-          <w:szCs w:val="28"/>
-        </w:rPr>
-        <w:t>parcial</w:t>
-      </w:r>
-      <w:r>
-        <w:rPr>
-          <w:rFonts w:ascii="Arial" w:hAnsi="Arial" w:cs="Arial"/>
-          <w:sz w:val="28"/>
-          <w:szCs w:val="28"/>
-        </w:rPr>
-        <w:t xml:space="preserve"> da r. sentença para</w:t>
-      </w:r>
-      <w:r>
-        <w:rPr>
-          <w:rFonts w:ascii="Arial" w:hAnsi="Arial" w:cs="Arial"/>
-          <w:sz w:val="28"/>
-          <w:szCs w:val="28"/>
-        </w:rPr>
-        <w:t xml:space="preserve"> declarar a inexigibilidade do débito relativo a dezembro de 2020, com a consequente inversão </w:t>
-      </w:r>
-      <w:r>
-        <w:rPr>
-          <w:rFonts w:ascii="Arial" w:hAnsi="Arial" w:cs="Arial"/>
-          <w:sz w:val="28"/>
-          <w:szCs w:val="28"/>
-        </w:rPr>
-        <w:t>do</w:t>
+        <w:t xml:space="preserve">Requer </w:t>
+      </w:r>
+      <w:r>
+        <w:rPr>
+          <w:rFonts w:ascii="Arial" w:hAnsi="Arial" w:cs="Arial"/>
+          <w:color w:val="808080"/>
+          <w:sz w:val="28"/>
+          <w:szCs w:val="28"/>
+        </w:rPr>
+        <w:t xml:space="preserve">o</w:t>
+      </w:r>
+      <w:r>
+        <w:rPr>
+          <w:rFonts w:ascii="Arial" w:hAnsi="Arial" w:cs="Arial"/>
+          <w:sz w:val="28"/>
+          <w:szCs w:val="28"/>
+        </w:rPr>
+        <w:t xml:space="preserve"> </w:t>
+      </w:r>
+      <w:r>
+        <w:rPr>
+          <w:rFonts w:ascii="Arial" w:hAnsi="Arial" w:cs="Arial"/>
+          <w:color w:val="808080"/>
+          <w:sz w:val="28"/>
+          <w:szCs w:val="28"/>
+        </w:rPr>
+        <w:t xml:space="preserve">provimento</w:t>
+      </w:r>
+      <w:r>
+        <w:rPr>
+          <w:rFonts w:ascii="Arial" w:hAnsi="Arial" w:cs="Arial"/>
+          <w:sz w:val="28"/>
+          <w:szCs w:val="28"/>
+        </w:rPr>
+        <w:t xml:space="preserve"> </w:t>
+      </w:r>
+      <w:r>
+        <w:rPr>
+          <w:rFonts w:ascii="Arial" w:hAnsi="Arial" w:cs="Arial"/>
+          <w:color w:val="808080"/>
+          <w:sz w:val="28"/>
+          <w:szCs w:val="28"/>
+        </w:rPr>
+        <w:t xml:space="preserve">do</w:t>
+      </w:r>
+      <w:r>
+        <w:rPr>
+          <w:rFonts w:ascii="Arial" w:hAnsi="Arial" w:cs="Arial"/>
+          <w:sz w:val="28"/>
+          <w:szCs w:val="28"/>
+        </w:rPr>
+        <w:t xml:space="preserve"> </w:t>
+      </w:r>
+      <w:r>
+        <w:rPr>
+          <w:rFonts w:ascii="Arial" w:hAnsi="Arial" w:cs="Arial"/>
+          <w:color w:val="808080"/>
+          <w:sz w:val="28"/>
+          <w:szCs w:val="28"/>
+        </w:rPr>
+        <w:t xml:space="preserve">apelo</w:t>
+      </w:r>
+      <w:r>
+        <w:rPr>
+          <w:rFonts w:ascii="Arial" w:hAnsi="Arial" w:cs="Arial"/>
+          <w:sz w:val="28"/>
+          <w:szCs w:val="28"/>
+        </w:rPr>
+        <w:t xml:space="preserve"> para</w:t>
+      </w:r>
+      <w:r>
+        <w:rPr>
+          <w:rFonts w:ascii="Arial" w:hAnsi="Arial" w:cs="Arial"/>
+          <w:sz w:val="28"/>
+          <w:szCs w:val="28"/>
+        </w:rPr>
+        <w:t xml:space="preserve"> declarar a inexigibilidade do débito relativo a dezembro de 2020, com a </w:t>
+      </w:r>
+      <w:r>
+        <w:rPr>
+          <w:rFonts w:ascii="Arial" w:hAnsi="Arial" w:cs="Arial"/>
+          <w:sz w:val="28"/>
+          <w:szCs w:val="28"/>
+        </w:rPr>
+        <w:t xml:space="preserve">inversão </w:t>
+      </w:r>
+      <w:r>
+        <w:rPr>
+          <w:rFonts w:ascii="Arial" w:hAnsi="Arial" w:cs="Arial"/>
+          <w:color w:val="808080"/>
+          <w:sz w:val="28"/>
+          <w:szCs w:val="28"/>
+        </w:rPr>
+        <w:t xml:space="preserve">dos</w:t>
       </w:r>
       <w:r>
         <w:rPr>
@@ -4737,15 +5079,32 @@
           <w:sz w:val="28"/>
           <w:szCs w:val="28"/>
         </w:rPr>
-        <w:t>de</w:t>
-      </w:r>
-      <w:r>
-        <w:rPr>
-          <w:rFonts w:ascii="Arial" w:hAnsi="Arial" w:cs="Arial"/>
-          <w:sz w:val="28"/>
-          <w:szCs w:val="28"/>
-        </w:rPr>
-        <w:t xml:space="preserve"> sucumbência. </w:t>
+        <w:t xml:space="preserve">de</w:t>
+      </w:r>
+      <w:r>
+        <w:rPr>
+          <w:rFonts w:ascii="Arial" w:hAnsi="Arial" w:cs="Arial"/>
+          <w:sz w:val="28"/>
+          <w:szCs w:val="28"/>
+        </w:rPr>
+        <w:t xml:space="preserve"> sucumbência</w:t>
+      </w:r>
+      <w:r>
+        <w:rPr>
+          <w:rFonts w:ascii="Arial" w:hAnsi="Arial" w:cs="Arial"/>
+          <w:color w:val="808080"/>
+          <w:sz w:val="28"/>
+          <w:szCs w:val="28"/>
+        </w:rPr>
+        <w:t xml:space="preserve"> e a majoração dos honorários em grau recursal (CPC 85 § 11)</w:t>
+      </w:r>
+      <w:r>
+        <w:rPr>
+          <w:rFonts w:ascii="Arial" w:hAnsi="Arial" w:cs="Arial"/>
+          <w:sz w:val="28"/>
+          <w:szCs w:val="28"/>
+        </w:rPr>
+        <w:t xml:space="preserve">. </w:t>
       </w:r>
     </w:p>
     <w:p>
@@ -4856,6 +5215,25 @@
       <w:r>
         <w:rPr>
           <w:rFonts w:ascii="Arial" w:hAnsi="Arial" w:eastAsia="Arial" w:cs="Arial"/>
+          <w:color w:val="808080"/>
+          <w:sz w:val="28"/>
+          <w:szCs w:val="28"/>
+        </w:rPr>
+        <w:t xml:space="preserve">: </w:t>
+      </w:r>
+      <w:r>
+        <w:rPr>
+          <w:rFonts w:ascii="Arial" w:hAnsi="Arial" w:eastAsia="Arial" w:cs="Arial"/>
+          <w:b/>
+          <w:color w:val="808080"/>
+          <w:sz w:val="28"/>
+          <w:szCs w:val="28"/>
+        </w:rPr>
+        <w:t xml:space="preserve">1)</w:t>
+      </w:r>
+      <w:r>
+        <w:rPr>
+          <w:rFonts w:ascii="Arial" w:hAnsi="Arial" w:eastAsia="Arial" w:cs="Arial"/>
           <w:sz w:val="28"/>
           <w:szCs w:val="28"/>
         </w:rPr>
@@ -4867,7 +5245,77 @@
           <w:sz w:val="28"/>
           <w:szCs w:val="28"/>
         </w:rPr>
-        <w:t xml:space="preserve">o débito referente a dezembro de 2020 é de responsabilidade da autora, que ocupava o imóvel e usufruía do serviço no período</w:t>
+        <w:t xml:space="preserve">o débito referente a dezembro de 2020 é de responsabilidade da autora, que </w:t>
+      </w:r>
+      <w:r>
+        <w:rPr>
+          <w:rFonts w:ascii="Arial" w:hAnsi="Arial" w:eastAsia="Arial" w:cs="Arial"/>
+          <w:color w:val="808080"/>
+          <w:sz w:val="28"/>
+          <w:szCs w:val="28"/>
+        </w:rPr>
+        <w:t xml:space="preserve">afirma</w:t>
+      </w:r>
+      <w:r>
+        <w:rPr>
+          <w:rFonts w:ascii="Arial" w:hAnsi="Arial" w:eastAsia="Arial" w:cs="Arial"/>
+          <w:sz w:val="28"/>
+          <w:szCs w:val="28"/>
+        </w:rPr>
+        <w:t xml:space="preserve"> </w:t>
+      </w:r>
+      <w:r>
+        <w:rPr>
+          <w:rFonts w:ascii="Arial" w:hAnsi="Arial" w:eastAsia="Arial" w:cs="Arial"/>
+          <w:color w:val="808080"/>
+          <w:sz w:val="28"/>
+          <w:szCs w:val="28"/>
+        </w:rPr>
+        <w:t xml:space="preserve">ter estado no</w:t>
+      </w:r>
+      <w:r>
+        <w:rPr>
+          <w:rFonts w:ascii="Arial" w:hAnsi="Arial" w:eastAsia="Arial" w:cs="Arial"/>
+          <w:sz w:val="28"/>
+          <w:szCs w:val="28"/>
+        </w:rPr>
+        <w:t xml:space="preserve"> imóvel</w:t>
+      </w:r>
+      <w:r>
+        <w:rPr>
+          <w:rFonts w:ascii="Arial" w:hAnsi="Arial" w:eastAsia="Arial" w:cs="Arial"/>
+          <w:sz w:val="28"/>
+          <w:szCs w:val="28"/>
+        </w:rPr>
+        <w:t xml:space="preserve"> no período</w:t>
+      </w:r>
+      <w:r>
+        <w:rPr>
+          <w:rFonts w:ascii="Arial" w:hAnsi="Arial" w:eastAsia="Arial" w:cs="Arial"/>
+          <w:color w:val="808080"/>
+          <w:sz w:val="28"/>
+          <w:szCs w:val="28"/>
+        </w:rPr>
+        <w:t xml:space="preserve">; e </w:t>
+      </w:r>
+      <w:r>
+        <w:rPr>
+          <w:rFonts w:ascii="Arial" w:hAnsi="Arial" w:eastAsia="Arial" w:cs="Arial"/>
+          <w:b/>
+          <w:color w:val="808080"/>
+          <w:sz w:val="28"/>
+          <w:szCs w:val="28"/>
+        </w:rPr>
+        <w:t xml:space="preserve">2)</w:t>
+      </w:r>
+      <w:r>
+        <w:rPr>
+          <w:rFonts w:ascii="Arial" w:hAnsi="Arial" w:eastAsia="Arial" w:cs="Arial"/>
+          <w:color w:val="808080"/>
+          <w:sz w:val="28"/>
+          <w:szCs w:val="28"/>
+        </w:rPr>
+        <w:t xml:space="preserve"> a sucumbência é recíproca, por critério objetivo</w:t>
       </w:r>
       <w:r>
         <w:rPr>
@@ -5005,39 +5453,39 @@
           <w:sz w:val="28"/>
           <w:szCs w:val="28"/>
         </w:rPr>
-        <w:t>28</w:t>
-      </w:r>
-      <w:r>
-        <w:rPr>
-          <w:rFonts w:ascii="Arial" w:hAnsi="Arial" w:cs="Arial"/>
-          <w:sz w:val="28"/>
-          <w:szCs w:val="28"/>
-        </w:rPr>
-        <w:t>/</w:t>
-      </w:r>
-      <w:r>
-        <w:rPr>
-          <w:rFonts w:ascii="Arial" w:hAnsi="Arial" w:cs="Arial"/>
-          <w:sz w:val="28"/>
-          <w:szCs w:val="28"/>
-        </w:rPr>
-        <w:t>10</w:t>
-      </w:r>
-      <w:r>
-        <w:rPr>
-          <w:rFonts w:ascii="Arial" w:hAnsi="Arial" w:cs="Arial"/>
-          <w:sz w:val="28"/>
-          <w:szCs w:val="28"/>
-        </w:rPr>
-        <w:t>/202</w:t>
-      </w:r>
-      <w:r>
-        <w:rPr>
-          <w:rFonts w:ascii="Arial" w:hAnsi="Arial" w:cs="Arial"/>
-          <w:sz w:val="28"/>
-          <w:szCs w:val="28"/>
-        </w:rPr>
-        <w:t>5</w:t>
+        <w:t xml:space="preserve">28</w:t>
+      </w:r>
+      <w:r>
+        <w:rPr>
+          <w:rFonts w:ascii="Arial" w:hAnsi="Arial" w:cs="Arial"/>
+          <w:sz w:val="28"/>
+          <w:szCs w:val="28"/>
+        </w:rPr>
+        <w:t xml:space="preserve">/</w:t>
+      </w:r>
+      <w:r>
+        <w:rPr>
+          <w:rFonts w:ascii="Arial" w:hAnsi="Arial" w:cs="Arial"/>
+          <w:sz w:val="28"/>
+          <w:szCs w:val="28"/>
+        </w:rPr>
+        <w:t xml:space="preserve">10</w:t>
+      </w:r>
+      <w:r>
+        <w:rPr>
+          <w:rFonts w:ascii="Arial" w:hAnsi="Arial" w:cs="Arial"/>
+          <w:sz w:val="28"/>
+          <w:szCs w:val="28"/>
+        </w:rPr>
+        <w:t xml:space="preserve">/202</w:t>
+      </w:r>
+      <w:r>
+        <w:rPr>
+          <w:rFonts w:ascii="Arial" w:hAnsi="Arial" w:cs="Arial"/>
+          <w:sz w:val="28"/>
+          <w:szCs w:val="28"/>
+        </w:rPr>
+        <w:t xml:space="preserve">5</w:t>
       </w:r>
       <w:r>
         <w:rPr>
@@ -5053,31 +5501,40 @@
           <w:sz w:val="28"/>
           <w:szCs w:val="28"/>
         </w:rPr>
-        <w:t>08</w:t>
-      </w:r>
-      <w:r>
-        <w:rPr>
-          <w:rFonts w:ascii="Arial" w:hAnsi="Arial" w:cs="Arial"/>
-          <w:sz w:val="28"/>
-          <w:szCs w:val="28"/>
-        </w:rPr>
-        <w:t>/0</w:t>
-      </w:r>
-      <w:r>
-        <w:rPr>
-          <w:rFonts w:ascii="Arial" w:hAnsi="Arial" w:cs="Arial"/>
-          <w:sz w:val="28"/>
-          <w:szCs w:val="28"/>
-        </w:rPr>
-        <w:t>7</w:t>
-      </w:r>
-      <w:r>
-        <w:rPr>
-          <w:rFonts w:ascii="Arial" w:hAnsi="Arial" w:cs="Arial"/>
-          <w:sz w:val="28"/>
-          <w:szCs w:val="28"/>
-        </w:rPr>
-        <w:t>/2026</w:t>
+        <w:t xml:space="preserve">08</w:t>
+      </w:r>
+      <w:r>
+        <w:rPr>
+          <w:rFonts w:ascii="Arial" w:hAnsi="Arial" w:cs="Arial"/>
+          <w:sz w:val="28"/>
+          <w:szCs w:val="28"/>
+        </w:rPr>
+        <w:t xml:space="preserve">/0</w:t>
+      </w:r>
+      <w:r>
+        <w:rPr>
+          <w:rFonts w:ascii="Arial" w:hAnsi="Arial" w:cs="Arial"/>
+          <w:sz w:val="28"/>
+          <w:szCs w:val="28"/>
+        </w:rPr>
+        <w:t xml:space="preserve">7</w:t>
+      </w:r>
+      <w:r>
+        <w:rPr>
+          <w:rFonts w:ascii="Arial" w:hAnsi="Arial" w:cs="Arial"/>
+          <w:color w:val="808080"/>
+          <w:sz w:val="28"/>
+          <w:szCs w:val="28"/>
+        </w:rPr>
+        <w:t xml:space="preserve">/2026. Sentença em embargos de declaração proferida em 12/08</w:t>
+      </w:r>
+      <w:r>
+        <w:rPr>
+          <w:rFonts w:ascii="Arial" w:hAnsi="Arial" w:cs="Arial"/>
+          <w:sz w:val="28"/>
+          <w:szCs w:val="28"/>
+        </w:rPr>
+        <w:t xml:space="preserve">/2026</w:t>
       </w:r>
       <w:r>
         <w:rPr>
@@ -5093,31 +5550,31 @@
           <w:sz w:val="28"/>
           <w:szCs w:val="28"/>
         </w:rPr>
-        <w:t>14</w:t>
-      </w:r>
-      <w:r>
-        <w:rPr>
-          <w:rFonts w:ascii="Arial" w:hAnsi="Arial" w:cs="Arial"/>
-          <w:sz w:val="28"/>
-          <w:szCs w:val="28"/>
-        </w:rPr>
-        <w:t>/0</w:t>
-      </w:r>
-      <w:r>
-        <w:rPr>
-          <w:rFonts w:ascii="Arial" w:hAnsi="Arial" w:cs="Arial"/>
-          <w:sz w:val="28"/>
-          <w:szCs w:val="28"/>
-        </w:rPr>
-        <w:t>8</w:t>
-      </w:r>
-      <w:r>
-        <w:rPr>
-          <w:rFonts w:ascii="Arial" w:hAnsi="Arial" w:cs="Arial"/>
-          <w:sz w:val="28"/>
-          <w:szCs w:val="28"/>
-        </w:rPr>
-        <w:t>/2026</w:t>
+        <w:t xml:space="preserve">14</w:t>
+      </w:r>
+      <w:r>
+        <w:rPr>
+          <w:rFonts w:ascii="Arial" w:hAnsi="Arial" w:cs="Arial"/>
+          <w:sz w:val="28"/>
+          <w:szCs w:val="28"/>
+        </w:rPr>
+        <w:t xml:space="preserve">/0</w:t>
+      </w:r>
+      <w:r>
+        <w:rPr>
+          <w:rFonts w:ascii="Arial" w:hAnsi="Arial" w:cs="Arial"/>
+          <w:sz w:val="28"/>
+          <w:szCs w:val="28"/>
+        </w:rPr>
+        <w:t xml:space="preserve">8</w:t>
+      </w:r>
+      <w:r>
+        <w:rPr>
+          <w:rFonts w:ascii="Arial" w:hAnsi="Arial" w:cs="Arial"/>
+          <w:sz w:val="28"/>
+          <w:szCs w:val="28"/>
+        </w:rPr>
+        <w:t xml:space="preserve">/2026</w:t>
       </w:r>
       <w:r>
         <w:rPr>
@@ -5141,15 +5598,15 @@
           <w:sz w:val="28"/>
           <w:szCs w:val="28"/>
         </w:rPr>
-        <w:t>1.765,64</w:t>
-      </w:r>
-      <w:r>
-        <w:rPr>
-          <w:rFonts w:ascii="Arial" w:hAnsi="Arial" w:cs="Arial"/>
-          <w:sz w:val="28"/>
-          <w:szCs w:val="28"/>
-        </w:rPr>
-        <w:t>.</w:t>
+        <w:t xml:space="preserve">1.765,64</w:t>
+      </w:r>
+      <w:r>
+        <w:rPr>
+          <w:rFonts w:ascii="Arial" w:hAnsi="Arial" w:cs="Arial"/>
+          <w:sz w:val="28"/>
+          <w:szCs w:val="28"/>
+        </w:rPr>
+        <w:t xml:space="preserve">.</w:t>
       </w:r>
     </w:p>
     <w:p>
@@ -5649,10 +6106,11 @@
       <w:r>
         <w:rPr>
           <w:rFonts w:ascii="Arial" w:hAnsi="Arial" w:eastAsia="Arial" w:cs="Arial"/>
-          <w:sz w:val="28"/>
-          <w:szCs w:val="28"/>
-        </w:rPr>
-        <w:t xml:space="preserve">;</w:t>
+          <w:color w:val="808080"/>
+          <w:sz w:val="28"/>
+          <w:szCs w:val="28"/>
+        </w:rPr>
+        <w:t xml:space="preserve">,</w:t>
       </w:r>
       <w:r>
         <w:rPr>
@@ -5667,16 +6125,61 @@
       <w:r>
         <w:rPr>
           <w:rFonts w:ascii="Arial" w:hAnsi="Arial" w:eastAsia="Arial" w:cs="Arial"/>
-          <w:sz w:val="28"/>
-          <w:szCs w:val="28"/>
-        </w:rPr>
-        <w:t xml:space="preserve">e </w:t>
-      </w:r>
-      <w:r>
-        <w:rPr>
-          <w:rFonts w:ascii="Arial" w:hAnsi="Arial" w:eastAsia="Arial" w:cs="Arial"/>
           <w:b/>
           <w:bCs/>
+          <w:color w:val="808080"/>
+          <w:sz w:val="28"/>
+          <w:szCs w:val="28"/>
+        </w:rPr>
+        <w:t xml:space="preserve">conforme</w:t>
+      </w:r>
+      <w:r>
+        <w:rPr>
+          <w:rFonts w:ascii="Arial" w:hAnsi="Arial" w:eastAsia="Arial" w:cs="Arial"/>
+          <w:sz w:val="28"/>
+          <w:szCs w:val="28"/>
+        </w:rPr>
+        <w:t xml:space="preserve"> a jurisprudência </w:t>
+      </w:r>
+      <w:r>
+        <w:rPr>
+          <w:rFonts w:ascii="Arial" w:hAnsi="Arial" w:eastAsia="Arial" w:cs="Arial"/>
+          <w:color w:val="808080"/>
+          <w:sz w:val="28"/>
+          <w:szCs w:val="28"/>
+        </w:rPr>
+        <w:t xml:space="preserve">do Tribunal de Justiça de São Paulo e</w:t>
+      </w:r>
+      <w:r>
+        <w:rPr>
+          <w:rFonts w:ascii="Arial" w:hAnsi="Arial" w:eastAsia="Arial" w:cs="Arial"/>
+          <w:sz w:val="28"/>
+          <w:szCs w:val="28"/>
+        </w:rPr>
+        <w:t xml:space="preserve"> do Superior Tribunal de Justiça</w:t>
+      </w:r>
+      <w:r>
+        <w:rPr>
+          <w:rFonts w:ascii="Arial" w:hAnsi="Arial" w:eastAsia="Arial" w:cs="Arial"/>
+          <w:color w:val="808080"/>
+          <w:sz w:val="28"/>
+          <w:szCs w:val="28"/>
+        </w:rPr>
+        <w:t xml:space="preserve">;</w:t>
+      </w:r>
+      <w:r>
+        <w:rPr>
+          <w:rFonts w:ascii="Arial" w:hAnsi="Arial" w:eastAsia="Arial" w:cs="Arial"/>
+          <w:sz w:val="28"/>
+          <w:szCs w:val="28"/>
+        </w:rPr>
+        <w:t xml:space="preserve"> e </w:t>
+      </w:r>
+      <w:r>
+        <w:rPr>
+          <w:rFonts w:ascii="Arial" w:hAnsi="Arial" w:eastAsia="Arial" w:cs="Arial"/>
+          <w:b/>
+          <w:color w:val="808080"/>
           <w:sz w:val="28"/>
           <w:szCs w:val="28"/>
         </w:rPr>
@@ -5688,24 +6191,169 @@
           <w:sz w:val="28"/>
           <w:szCs w:val="28"/>
         </w:rPr>
+        <w:t xml:space="preserve"> a </w:t>
+      </w:r>
+      <w:r>
+        <w:rPr>
+          <w:rFonts w:ascii="Arial" w:hAnsi="Arial" w:eastAsia="Arial" w:cs="Arial"/>
+          <w:color w:val="808080"/>
+          <w:sz w:val="28"/>
+          <w:szCs w:val="28"/>
+        </w:rPr>
+        <w:t xml:space="preserve">tese</w:t>
+      </w:r>
+      <w:r>
+        <w:rPr>
+          <w:rFonts w:ascii="Arial" w:hAnsi="Arial" w:eastAsia="Arial" w:cs="Arial"/>
+          <w:sz w:val="28"/>
+          <w:szCs w:val="28"/>
+        </w:rPr>
         <w:t xml:space="preserve"> </w:t>
       </w:r>
       <w:r>
         <w:rPr>
           <w:rFonts w:ascii="Arial" w:hAnsi="Arial" w:eastAsia="Arial" w:cs="Arial"/>
-          <w:sz w:val="28"/>
-          <w:szCs w:val="28"/>
-        </w:rPr>
-        <w:t xml:space="preserve">a sentença contrariou a jurisprudência consolidada do Superior Tribunal de Justiça e de outros tribunais, segundo a qual débitos de consumo possuem caráter pessoal e não podem ser exigidos do atual usuário, proprietário ou possuidor do imóvel quando contraídos por terceiro</w:t>
-      </w:r>
-      <w:r>
-        <w:rPr>
-          <w:rFonts w:ascii="Arial" w:hAnsi="Arial" w:eastAsia="Arial" w:cs="Arial"/>
-          <w:color w:val="808080"/>
-          <w:sz w:val="28"/>
-          <w:szCs w:val="28"/>
-        </w:rPr>
-        <w:t xml:space="preserve"> (ID 89370589)</w:t>
+          <w:color w:val="808080"/>
+          <w:sz w:val="28"/>
+          <w:szCs w:val="28"/>
+        </w:rPr>
+        <w:t xml:space="preserve">do</w:t>
+      </w:r>
+      <w:r>
+        <w:rPr>
+          <w:rFonts w:ascii="Arial" w:hAnsi="Arial" w:eastAsia="Arial" w:cs="Arial"/>
+          <w:sz w:val="28"/>
+          <w:szCs w:val="28"/>
+        </w:rPr>
+        <w:t xml:space="preserve"> </w:t>
+      </w:r>
+      <w:r>
+        <w:rPr>
+          <w:rFonts w:ascii="Arial" w:hAnsi="Arial" w:eastAsia="Arial" w:cs="Arial"/>
+          <w:color w:val="808080"/>
+          <w:sz w:val="28"/>
+          <w:szCs w:val="28"/>
+        </w:rPr>
+        <w:t xml:space="preserve">enriquecimento</w:t>
+      </w:r>
+      <w:r>
+        <w:rPr>
+          <w:rFonts w:ascii="Arial" w:hAnsi="Arial" w:eastAsia="Arial" w:cs="Arial"/>
+          <w:sz w:val="28"/>
+          <w:szCs w:val="28"/>
+        </w:rPr>
+        <w:t xml:space="preserve"> </w:t>
+      </w:r>
+      <w:r>
+        <w:rPr>
+          <w:rFonts w:ascii="Arial" w:hAnsi="Arial" w:eastAsia="Arial" w:cs="Arial"/>
+          <w:color w:val="808080"/>
+          <w:sz w:val="28"/>
+          <w:szCs w:val="28"/>
+        </w:rPr>
+        <w:t xml:space="preserve">sem</w:t>
+      </w:r>
+      <w:r>
+        <w:rPr>
+          <w:rFonts w:ascii="Arial" w:hAnsi="Arial" w:eastAsia="Arial" w:cs="Arial"/>
+          <w:sz w:val="28"/>
+          <w:szCs w:val="28"/>
+        </w:rPr>
+        <w:t xml:space="preserve"> </w:t>
+      </w:r>
+      <w:r>
+        <w:rPr>
+          <w:rFonts w:ascii="Arial" w:hAnsi="Arial" w:eastAsia="Arial" w:cs="Arial"/>
+          <w:color w:val="808080"/>
+          <w:sz w:val="28"/>
+          <w:szCs w:val="28"/>
+        </w:rPr>
+        <w:t xml:space="preserve">causa</w:t>
+      </w:r>
+      <w:r>
+        <w:rPr>
+          <w:rFonts w:ascii="Arial" w:hAnsi="Arial" w:eastAsia="Arial" w:cs="Arial"/>
+          <w:sz w:val="28"/>
+          <w:szCs w:val="28"/>
+        </w:rPr>
+        <w:t xml:space="preserve"> </w:t>
+      </w:r>
+      <w:r>
+        <w:rPr>
+          <w:rFonts w:ascii="Arial" w:hAnsi="Arial" w:eastAsia="Arial" w:cs="Arial"/>
+          <w:color w:val="808080"/>
+          <w:sz w:val="28"/>
+          <w:szCs w:val="28"/>
+        </w:rPr>
+        <w:t xml:space="preserve">deve</w:t>
+      </w:r>
+      <w:r>
+        <w:rPr>
+          <w:rFonts w:ascii="Arial" w:hAnsi="Arial" w:eastAsia="Arial" w:cs="Arial"/>
+          <w:sz w:val="28"/>
+          <w:szCs w:val="28"/>
+        </w:rPr>
+        <w:t xml:space="preserve"> ser </w:t>
+      </w:r>
+      <w:r>
+        <w:rPr>
+          <w:rFonts w:ascii="Arial" w:hAnsi="Arial" w:eastAsia="Arial" w:cs="Arial"/>
+          <w:color w:val="808080"/>
+          <w:sz w:val="28"/>
+          <w:szCs w:val="28"/>
+        </w:rPr>
+        <w:t xml:space="preserve">rechaçada, pois o enriquecimento ilícito seria da concessionária, que cobra da apelante dívida</w:t>
+      </w:r>
+      <w:r>
+        <w:rPr>
+          <w:rFonts w:ascii="Arial" w:hAnsi="Arial" w:eastAsia="Arial" w:cs="Arial"/>
+          <w:sz w:val="28"/>
+          <w:szCs w:val="28"/>
+        </w:rPr>
+        <w:t xml:space="preserve"> do </w:t>
+      </w:r>
+      <w:r>
+        <w:rPr>
+          <w:rFonts w:ascii="Arial" w:hAnsi="Arial" w:eastAsia="Arial" w:cs="Arial"/>
+          <w:color w:val="808080"/>
+          <w:sz w:val="28"/>
+          <w:szCs w:val="28"/>
+        </w:rPr>
+        <w:t xml:space="preserve">espólio</w:t>
+      </w:r>
+      <w:r>
+        <w:rPr>
+          <w:rFonts w:ascii="Arial" w:hAnsi="Arial" w:eastAsia="Arial" w:cs="Arial"/>
+          <w:sz w:val="28"/>
+          <w:szCs w:val="28"/>
+        </w:rPr>
+        <w:t xml:space="preserve"> </w:t>
+      </w:r>
+      <w:r>
+        <w:rPr>
+          <w:rFonts w:ascii="Arial" w:hAnsi="Arial" w:eastAsia="Arial" w:cs="Arial"/>
+          <w:color w:val="808080"/>
+          <w:sz w:val="28"/>
+          <w:szCs w:val="28"/>
+        </w:rPr>
+        <w:t xml:space="preserve">(ID</w:t>
+      </w:r>
+      <w:r>
+        <w:rPr>
+          <w:rFonts w:ascii="Arial" w:hAnsi="Arial" w:eastAsia="Arial" w:cs="Arial"/>
+          <w:sz w:val="28"/>
+          <w:szCs w:val="28"/>
+        </w:rPr>
+        <w:t xml:space="preserve"> </w:t>
+      </w:r>
+      <w:r>
+        <w:rPr>
+          <w:rFonts w:ascii="Arial" w:hAnsi="Arial" w:eastAsia="Arial" w:cs="Arial"/>
+          <w:color w:val="808080"/>
+          <w:sz w:val="28"/>
+          <w:szCs w:val="28"/>
+        </w:rPr>
+        <w:t xml:space="preserve">89370589)</w:t>
       </w:r>
       <w:r>
         <w:rPr>
@@ -6203,23 +6851,7 @@
           <w:sz w:val="28"/>
           <w:szCs w:val="28"/>
         </w:rPr>
-        <w:t xml:space="preserve">. </w:t>
-      </w:r>
-      <w:r>
-        <w:rPr>
-          <w:rFonts w:ascii="Arial" w:hAnsi="Arial" w:eastAsia="Arial" w:cs="Arial"/>
-          <w:sz w:val="28"/>
-          <w:szCs w:val="28"/>
-        </w:rPr>
-        <w:t xml:space="preserve">Essa</w:t>
-      </w:r>
-      <w:r>
-        <w:rPr>
-          <w:rFonts w:ascii="Arial" w:hAnsi="Arial" w:eastAsia="Arial" w:cs="Arial"/>
-          <w:sz w:val="28"/>
-          <w:szCs w:val="28"/>
-        </w:rPr>
-        <w:t xml:space="preserve"> versão foi reiterada ao longo da demanda.</w:t>
+        <w:t xml:space="preserve">.</w:t>
       </w:r>
     </w:p>
     <w:p>
@@ -6235,20 +6867,16 @@
         <w:spacing w:after="0" w:line="360" w:lineRule="auto"/>
         <w:ind w:firstLine="2268"/>
         <w:jc w:val="both"/>
-        <w:rPr>
-          <w:rFonts w:ascii="Arial" w:hAnsi="Arial" w:eastAsia="Arial" w:cs="Arial"/>
-          <w:sz w:val="28"/>
-          <w:szCs w:val="28"/>
-        </w:rPr>
-      </w:pPr>
-      <w:r>
-        <w:rPr>
-          <w:rFonts w:ascii="Arial" w:hAnsi="Arial" w:eastAsia="Arial" w:cs="Arial"/>
-          <w:color w:val="808080"/>
-          <w:sz w:val="28"/>
-          <w:szCs w:val="28"/>
-        </w:rPr>
-        <w:t xml:space="preserve">No</w:t>
+        <w:rPr/>
+      </w:pPr>
+      <w:r>
+        <w:rPr>
+          <w:rFonts w:ascii="Arial" w:hAnsi="Arial" w:eastAsia="Arial" w:cs="Arial"/>
+          <w:color w:val="808080"/>
+          <w:sz w:val="28"/>
+          <w:szCs w:val="28"/>
+        </w:rPr>
+        <w:t xml:space="preserve">Ao</w:t>
       </w:r>
       <w:r>
         <w:rPr>
@@ -6265,56 +6893,109 @@
           <w:sz w:val="28"/>
           <w:szCs w:val="28"/>
         </w:rPr>
-        <w:t xml:space="preserve">mais</w:t>
-      </w:r>
-      <w:r>
-        <w:rPr>
-          <w:rFonts w:ascii="Arial" w:hAnsi="Arial" w:eastAsia="Arial" w:cs="Arial"/>
-          <w:sz w:val="28"/>
-          <w:szCs w:val="28"/>
-        </w:rPr>
-        <w:t xml:space="preserve">, a escritura pública</w:t>
-      </w:r>
-      <w:r>
-        <w:rPr>
-          <w:rFonts w:ascii="Arial" w:hAnsi="Arial" w:eastAsia="Arial" w:cs="Arial"/>
-          <w:sz w:val="28"/>
-          <w:szCs w:val="28"/>
-        </w:rPr>
-        <w:t xml:space="preserve"> indica que o imóvel foi adquirido da </w:t>
-      </w:r>
-      <w:r>
-        <w:rPr>
-          <w:rFonts w:ascii="Arial" w:hAnsi="Arial" w:eastAsia="Arial" w:cs="Arial"/>
-          <w:sz w:val="28"/>
-          <w:szCs w:val="28"/>
-        </w:rPr>
-        <w:t xml:space="preserve">T</w:t>
-      </w:r>
-      <w:r>
-        <w:rPr>
-          <w:rFonts w:ascii="Arial" w:hAnsi="Arial" w:eastAsia="Arial" w:cs="Arial"/>
-          <w:sz w:val="28"/>
-          <w:szCs w:val="28"/>
-        </w:rPr>
-        <w:t xml:space="preserve">erracap</w:t>
-      </w:r>
-      <w:r>
-        <w:rPr>
-          <w:rFonts w:ascii="Arial" w:hAnsi="Arial" w:eastAsia="Arial" w:cs="Arial"/>
-          <w:sz w:val="28"/>
-          <w:szCs w:val="28"/>
-        </w:rPr>
-        <w:t xml:space="preserve"> por negócio oneroso, também em 2023</w:t>
-      </w:r>
-      <w:r>
-        <w:rPr>
-          <w:rFonts w:ascii="Arial" w:hAnsi="Arial" w:eastAsia="Arial" w:cs="Arial"/>
-          <w:color w:val="808080"/>
-          <w:sz w:val="28"/>
-          <w:szCs w:val="28"/>
-        </w:rPr>
-        <w:t xml:space="preserve"> (ID 89370541)</w:t>
+        <w:t xml:space="preserve">contrário</w:t>
+      </w:r>
+      <w:r>
+        <w:rPr>
+          <w:rFonts w:ascii="Arial" w:hAnsi="Arial" w:eastAsia="Arial" w:cs="Arial"/>
+          <w:sz w:val="28"/>
+          <w:szCs w:val="28"/>
+        </w:rPr>
+        <w:t xml:space="preserve"> </w:t>
+      </w:r>
+      <w:r>
+        <w:rPr>
+          <w:rFonts w:ascii="Arial" w:hAnsi="Arial" w:eastAsia="Arial" w:cs="Arial"/>
+          <w:color w:val="808080"/>
+          <w:sz w:val="28"/>
+          <w:szCs w:val="28"/>
+        </w:rPr>
+        <w:t xml:space="preserve">do</w:t>
+      </w:r>
+      <w:r>
+        <w:rPr>
+          <w:rFonts w:ascii="Arial" w:hAnsi="Arial" w:eastAsia="Arial" w:cs="Arial"/>
+          <w:sz w:val="28"/>
+          <w:szCs w:val="28"/>
+        </w:rPr>
+        <w:t xml:space="preserve"> </w:t>
+      </w:r>
+      <w:r>
+        <w:rPr>
+          <w:rFonts w:ascii="Arial" w:hAnsi="Arial" w:eastAsia="Arial" w:cs="Arial"/>
+          <w:color w:val="808080"/>
+          <w:sz w:val="28"/>
+          <w:szCs w:val="28"/>
+        </w:rPr>
+        <w:t xml:space="preserve">que</w:t>
+      </w:r>
+      <w:r>
+        <w:rPr>
+          <w:rFonts w:ascii="Arial" w:hAnsi="Arial" w:eastAsia="Arial" w:cs="Arial"/>
+          <w:sz w:val="28"/>
+          <w:szCs w:val="28"/>
+        </w:rPr>
+        <w:t xml:space="preserve"> </w:t>
+      </w:r>
+      <w:r>
+        <w:rPr>
+          <w:rFonts w:ascii="Arial" w:hAnsi="Arial" w:eastAsia="Arial" w:cs="Arial"/>
+          <w:color w:val="808080"/>
+          <w:sz w:val="28"/>
+          <w:szCs w:val="28"/>
+        </w:rPr>
+        <w:t xml:space="preserve">registrou</w:t>
+      </w:r>
+      <w:r>
+        <w:rPr>
+          <w:rFonts w:ascii="Arial" w:hAnsi="Arial" w:eastAsia="Arial" w:cs="Arial"/>
+          <w:sz w:val="28"/>
+          <w:szCs w:val="28"/>
+        </w:rPr>
+        <w:t xml:space="preserve"> </w:t>
+      </w:r>
+      <w:r>
+        <w:rPr>
+          <w:rFonts w:ascii="Arial" w:hAnsi="Arial" w:eastAsia="Arial" w:cs="Arial"/>
+          <w:color w:val="808080"/>
+          <w:sz w:val="28"/>
+          <w:szCs w:val="28"/>
+        </w:rPr>
+        <w:t xml:space="preserve">a</w:t>
+      </w:r>
+      <w:r>
+        <w:rPr>
+          <w:rFonts w:ascii="Arial" w:hAnsi="Arial" w:eastAsia="Arial" w:cs="Arial"/>
+          <w:sz w:val="28"/>
+          <w:szCs w:val="28"/>
+        </w:rPr>
+        <w:t xml:space="preserve"> </w:t>
+      </w:r>
+      <w:r>
+        <w:rPr>
+          <w:rFonts w:ascii="Arial" w:hAnsi="Arial" w:eastAsia="Arial" w:cs="Arial"/>
+          <w:color w:val="808080"/>
+          <w:sz w:val="28"/>
+          <w:szCs w:val="28"/>
+        </w:rPr>
+        <w:t xml:space="preserve">sentença, a autora não reconhece posse anterior: afirmou, nos embargos de declaração, que residia em outro imóvel e somente tomou posse após a lavratura</w:t>
+      </w:r>
+      <w:r>
+        <w:rPr>
+          <w:rFonts w:ascii="Arial" w:hAnsi="Arial" w:eastAsia="Arial" w:cs="Arial"/>
+          <w:sz w:val="28"/>
+          <w:szCs w:val="28"/>
+        </w:rPr>
+        <w:t xml:space="preserve"> da </w:t>
+      </w:r>
+      <w:r>
+        <w:rPr>
+          <w:rFonts w:ascii="Arial" w:hAnsi="Arial" w:eastAsia="Arial" w:cs="Arial"/>
+          <w:color w:val="808080"/>
+          <w:sz w:val="28"/>
+          <w:szCs w:val="28"/>
+        </w:rPr>
+        <w:t xml:space="preserve">escritura (ID 89370541)</w:t>
       </w:r>
       <w:r>
         <w:rPr>
@@ -6323,13 +7004,6 @@
           <w:szCs w:val="28"/>
         </w:rPr>
         <w:t xml:space="preserve">.</w:t>
-      </w:r>
-      <w:commentRangeEnd w:id="15"/>
-      <w:r>
-        <w:rPr>
-          <w:rStyle w:val="CommentReference"/>
-        </w:rPr>
-        <w:commentReference w:id="15"/>
       </w:r>
     </w:p>
     <w:p>
@@ -6337,11 +7011,7 @@
         <w:spacing w:after="0" w:line="360" w:lineRule="auto"/>
         <w:ind w:firstLine="2268"/>
         <w:jc w:val="both"/>
-        <w:rPr>
-          <w:rFonts w:ascii="Arial" w:hAnsi="Arial" w:eastAsia="Arial" w:cs="Arial"/>
-          <w:sz w:val="28"/>
-          <w:szCs w:val="28"/>
-        </w:rPr>
+        <w:rPr/>
       </w:pPr>
     </w:p>
     <w:p>
@@ -6349,40 +7019,120 @@
         <w:spacing w:after="0" w:line="360" w:lineRule="auto"/>
         <w:ind w:firstLine="2268"/>
         <w:jc w:val="both"/>
-        <w:rPr/>
-      </w:pPr>
-      <w:r>
-        <w:rPr>
-          <w:rFonts w:ascii="Arial" w:hAnsi="Arial" w:eastAsia="Arial" w:cs="Arial"/>
-          <w:sz w:val="28"/>
-          <w:szCs w:val="28"/>
-        </w:rPr>
-        <w:t xml:space="preserve">Os elementos produzidos pela concessionária demonstram que a autora manteve contato com a </w:t>
-      </w:r>
-      <w:r>
-        <w:rPr>
-          <w:rFonts w:ascii="Arial" w:hAnsi="Arial" w:eastAsia="Arial" w:cs="Arial"/>
-          <w:color w:val="808080"/>
-          <w:sz w:val="28"/>
-          <w:szCs w:val="28"/>
-        </w:rPr>
-        <w:t xml:space="preserve">CAESB</w:t>
-      </w:r>
-      <w:r>
-        <w:rPr>
-          <w:rFonts w:ascii="Arial" w:hAnsi="Arial" w:eastAsia="Arial" w:cs="Arial"/>
-          <w:sz w:val="28"/>
-          <w:szCs w:val="28"/>
-        </w:rPr>
-        <w:t xml:space="preserve"> acerca da unidade consumidora</w:t>
-      </w:r>
-      <w:r>
-        <w:rPr>
-          <w:rFonts w:ascii="Arial" w:hAnsi="Arial" w:eastAsia="Arial" w:cs="Arial"/>
-          <w:sz w:val="28"/>
-          <w:szCs w:val="28"/>
-        </w:rPr>
-        <w:t xml:space="preserve"> (ID 89370549)</w:t>
+        <w:rPr>
+          <w:rFonts w:ascii="Arial" w:hAnsi="Arial" w:eastAsia="Arial" w:cs="Arial"/>
+          <w:sz w:val="28"/>
+          <w:szCs w:val="28"/>
+        </w:rPr>
+      </w:pPr>
+      <w:r>
+        <w:rPr>
+          <w:rFonts w:ascii="Arial" w:hAnsi="Arial" w:eastAsia="Arial" w:cs="Arial"/>
+          <w:color w:val="808080"/>
+          <w:sz w:val="28"/>
+          <w:szCs w:val="28"/>
+        </w:rPr>
+        <w:t xml:space="preserve">No</w:t>
+      </w:r>
+      <w:r>
+        <w:rPr>
+          <w:rFonts w:ascii="Arial" w:hAnsi="Arial" w:eastAsia="Arial" w:cs="Arial"/>
+          <w:sz w:val="28"/>
+          <w:szCs w:val="28"/>
+        </w:rPr>
+        <w:t xml:space="preserve"> </w:t>
+      </w:r>
+      <w:r>
+        <w:rPr>
+          <w:rFonts w:ascii="Arial" w:hAnsi="Arial" w:eastAsia="Arial" w:cs="Arial"/>
+          <w:color w:val="808080"/>
+          <w:sz w:val="28"/>
+          <w:szCs w:val="28"/>
+        </w:rPr>
+        <w:t xml:space="preserve">mais</w:t>
+      </w:r>
+      <w:r>
+        <w:rPr>
+          <w:rFonts w:ascii="Arial" w:hAnsi="Arial" w:eastAsia="Arial" w:cs="Arial"/>
+          <w:sz w:val="28"/>
+          <w:szCs w:val="28"/>
+        </w:rPr>
+        <w:t xml:space="preserve">, a escritura pública</w:t>
+      </w:r>
+      <w:r>
+        <w:rPr>
+          <w:rFonts w:ascii="Arial" w:hAnsi="Arial" w:eastAsia="Arial" w:cs="Arial"/>
+          <w:sz w:val="28"/>
+          <w:szCs w:val="28"/>
+        </w:rPr>
+        <w:t xml:space="preserve"> indica que o imóvel foi adquirido da </w:t>
+      </w:r>
+      <w:r>
+        <w:rPr>
+          <w:rFonts w:ascii="Arial" w:hAnsi="Arial" w:eastAsia="Arial" w:cs="Arial"/>
+          <w:sz w:val="28"/>
+          <w:szCs w:val="28"/>
+        </w:rPr>
+        <w:t xml:space="preserve">T</w:t>
+      </w:r>
+      <w:r>
+        <w:rPr>
+          <w:rFonts w:ascii="Arial" w:hAnsi="Arial" w:eastAsia="Arial" w:cs="Arial"/>
+          <w:sz w:val="28"/>
+          <w:szCs w:val="28"/>
+        </w:rPr>
+        <w:t xml:space="preserve">erracap</w:t>
+      </w:r>
+      <w:r>
+        <w:rPr>
+          <w:rFonts w:ascii="Arial" w:hAnsi="Arial" w:eastAsia="Arial" w:cs="Arial"/>
+          <w:color w:val="808080"/>
+          <w:sz w:val="28"/>
+          <w:szCs w:val="28"/>
+        </w:rPr>
+        <w:t xml:space="preserve">,</w:t>
+      </w:r>
+      <w:r>
+        <w:rPr>
+          <w:rFonts w:ascii="Arial" w:hAnsi="Arial" w:eastAsia="Arial" w:cs="Arial"/>
+          <w:sz w:val="28"/>
+          <w:szCs w:val="28"/>
+        </w:rPr>
+        <w:t xml:space="preserve"> por negócio oneroso, </w:t>
+      </w:r>
+      <w:r>
+        <w:rPr>
+          <w:rFonts w:ascii="Arial" w:hAnsi="Arial" w:eastAsia="Arial" w:cs="Arial"/>
+          <w:sz w:val="28"/>
+          <w:szCs w:val="28"/>
+        </w:rPr>
+        <w:t xml:space="preserve">em </w:t>
+      </w:r>
+      <w:r>
+        <w:rPr>
+          <w:rFonts w:ascii="Arial" w:hAnsi="Arial" w:eastAsia="Arial" w:cs="Arial"/>
+          <w:color w:val="808080"/>
+          <w:sz w:val="28"/>
+          <w:szCs w:val="28"/>
+        </w:rPr>
+        <w:t xml:space="preserve">11/4/</w:t>
+      </w:r>
+      <w:r>
+        <w:rPr>
+          <w:rFonts w:ascii="Arial" w:hAnsi="Arial" w:eastAsia="Arial" w:cs="Arial"/>
+          <w:sz w:val="28"/>
+          <w:szCs w:val="28"/>
+        </w:rPr>
+        <w:t xml:space="preserve">2023</w:t>
+      </w:r>
+      <w:r>
+        <w:rPr>
+          <w:rFonts w:ascii="Arial" w:hAnsi="Arial" w:eastAsia="Arial" w:cs="Arial"/>
+          <w:color w:val="808080"/>
+          <w:sz w:val="28"/>
+          <w:szCs w:val="28"/>
+        </w:rPr>
+        <w:t xml:space="preserve"> (ID 89370528)</w:t>
       </w:r>
       <w:r>
         <w:rPr>
@@ -6391,6 +7141,13 @@
           <w:szCs w:val="28"/>
         </w:rPr>
         <w:t xml:space="preserve">.</w:t>
+      </w:r>
+      <w:commentRangeEnd w:id="15"/>
+      <w:r>
+        <w:rPr>
+          <w:rStyle w:val="CommentReference"/>
+        </w:rPr>
+        <w:commentReference w:id="15"/>
       </w:r>
     </w:p>
     <w:p>
@@ -6398,7 +7155,11 @@
         <w:spacing w:after="0" w:line="360" w:lineRule="auto"/>
         <w:ind w:firstLine="2268"/>
         <w:jc w:val="both"/>
-        <w:rPr/>
+        <w:rPr>
+          <w:rFonts w:ascii="Arial" w:hAnsi="Arial" w:eastAsia="Arial" w:cs="Arial"/>
+          <w:sz w:val="28"/>
+          <w:szCs w:val="28"/>
+        </w:rPr>
       </w:pPr>
     </w:p>
     <w:p>
@@ -6406,14 +7167,118 @@
         <w:spacing w:after="0" w:line="360" w:lineRule="auto"/>
         <w:ind w:firstLine="2268"/>
         <w:jc w:val="both"/>
-      </w:pPr>
-      <w:r>
-        <w:rPr>
-          <w:rFonts w:ascii="Arial" w:hAnsi="Arial" w:eastAsia="Arial" w:cs="Arial"/>
-          <w:sz w:val="28"/>
-          <w:szCs w:val="28"/>
-        </w:rPr>
-        <w:t xml:space="preserve">Todavia, tais registros constituem mero indício de vínculo com o imóvel e não comprovam, por si sós, que a apelante utilizava o serviço ou ocupava a unidade em dezembro de 2020, circunstância indispensável para legitimar a cobrança em seu desfavor.</w:t>
+        <w:rPr/>
+      </w:pPr>
+      <w:commentRangeStart w:id="16"/>
+      <w:r>
+        <w:rPr>
+          <w:rFonts w:ascii="Arial" w:hAnsi="Arial" w:eastAsia="Arial" w:cs="Arial"/>
+          <w:color w:val="808080"/>
+          <w:sz w:val="28"/>
+          <w:szCs w:val="28"/>
+        </w:rPr>
+        <w:t xml:space="preserve">A</w:t>
+      </w:r>
+      <w:r>
+        <w:rPr>
+          <w:rFonts w:ascii="Arial" w:hAnsi="Arial" w:eastAsia="Arial" w:cs="Arial"/>
+          <w:sz w:val="28"/>
+          <w:szCs w:val="28"/>
+        </w:rPr>
+        <w:t xml:space="preserve"> concessionária </w:t>
+      </w:r>
+      <w:r>
+        <w:rPr>
+          <w:rFonts w:ascii="Arial" w:hAnsi="Arial" w:eastAsia="Arial" w:cs="Arial"/>
+          <w:color w:val="808080"/>
+          <w:sz w:val="28"/>
+          <w:szCs w:val="28"/>
+        </w:rPr>
+        <w:t xml:space="preserve">sustenta</w:t>
+      </w:r>
+      <w:r>
+        <w:rPr>
+          <w:rFonts w:ascii="Arial" w:hAnsi="Arial" w:eastAsia="Arial" w:cs="Arial"/>
+          <w:sz w:val="28"/>
+          <w:szCs w:val="28"/>
+        </w:rPr>
+        <w:t xml:space="preserve"> que a autora </w:t>
+      </w:r>
+      <w:r>
+        <w:rPr>
+          <w:rFonts w:ascii="Arial" w:hAnsi="Arial" w:eastAsia="Arial" w:cs="Arial"/>
+          <w:color w:val="808080"/>
+          <w:sz w:val="28"/>
+          <w:szCs w:val="28"/>
+        </w:rPr>
+        <w:t xml:space="preserve">figura</w:t>
+      </w:r>
+      <w:r>
+        <w:rPr>
+          <w:rFonts w:ascii="Arial" w:hAnsi="Arial" w:eastAsia="Arial" w:cs="Arial"/>
+          <w:sz w:val="28"/>
+          <w:szCs w:val="28"/>
+        </w:rPr>
+        <w:t xml:space="preserve"> </w:t>
+      </w:r>
+      <w:r>
+        <w:rPr>
+          <w:rFonts w:ascii="Arial" w:hAnsi="Arial" w:eastAsia="Arial" w:cs="Arial"/>
+          <w:color w:val="808080"/>
+          <w:sz w:val="28"/>
+          <w:szCs w:val="28"/>
+        </w:rPr>
+        <w:t xml:space="preserve">no</w:t>
+      </w:r>
+      <w:r>
+        <w:rPr>
+          <w:rFonts w:ascii="Arial" w:hAnsi="Arial" w:eastAsia="Arial" w:cs="Arial"/>
+          <w:sz w:val="28"/>
+          <w:szCs w:val="28"/>
+        </w:rPr>
+        <w:t xml:space="preserve"> </w:t>
+      </w:r>
+      <w:r>
+        <w:rPr>
+          <w:rFonts w:ascii="Arial" w:hAnsi="Arial" w:eastAsia="Arial" w:cs="Arial"/>
+          <w:color w:val="808080"/>
+          <w:sz w:val="28"/>
+          <w:szCs w:val="28"/>
+        </w:rPr>
+        <w:t xml:space="preserve">cadastro</w:t>
+      </w:r>
+      <w:r>
+        <w:rPr>
+          <w:rFonts w:ascii="Arial" w:hAnsi="Arial" w:eastAsia="Arial" w:cs="Arial"/>
+          <w:sz w:val="28"/>
+          <w:szCs w:val="28"/>
+        </w:rPr>
+        <w:t xml:space="preserve"> da unidade </w:t>
+      </w:r>
+      <w:r>
+        <w:rPr>
+          <w:rFonts w:ascii="Arial" w:hAnsi="Arial" w:eastAsia="Arial" w:cs="Arial"/>
+          <w:color w:val="808080"/>
+          <w:sz w:val="28"/>
+          <w:szCs w:val="28"/>
+        </w:rPr>
+        <w:t xml:space="preserve">desde 10/12/2020 e que, em 22/12/2020, o usuário solicitou revisão da conta, conforme a ordem de serviço nº 2500100122055908</w:t>
+      </w:r>
+      <w:r>
+        <w:rPr>
+          <w:rFonts w:ascii="Arial" w:hAnsi="Arial" w:eastAsia="Arial" w:cs="Arial"/>
+          <w:sz w:val="28"/>
+          <w:szCs w:val="28"/>
+        </w:rPr>
+        <w:t xml:space="preserve"> (ID 89370549)</w:t>
+      </w:r>
+      <w:r>
+        <w:rPr>
+          <w:rFonts w:ascii="Arial" w:hAnsi="Arial" w:eastAsia="Arial" w:cs="Arial"/>
+          <w:sz w:val="28"/>
+          <w:szCs w:val="28"/>
+        </w:rPr>
+        <w:t xml:space="preserve">.</w:t>
       </w:r>
     </w:p>
     <w:p>
@@ -6421,11 +7286,7 @@
         <w:spacing w:after="0" w:line="360" w:lineRule="auto"/>
         <w:ind w:firstLine="2268"/>
         <w:jc w:val="both"/>
-        <w:rPr>
-          <w:rFonts w:ascii="Arial" w:hAnsi="Arial" w:eastAsia="Arial" w:cs="Arial"/>
-          <w:sz w:val="28"/>
-          <w:szCs w:val="28"/>
-        </w:rPr>
+        <w:rPr/>
       </w:pPr>
     </w:p>
     <w:p>
@@ -6433,16 +7294,174 @@
         <w:spacing w:after="0" w:line="360" w:lineRule="auto"/>
         <w:ind w:firstLine="2268"/>
         <w:jc w:val="both"/>
-        <w:rPr/>
-      </w:pPr>
-      <w:commentRangeStart w:id="16"/>
-      <w:r>
-        <w:rPr>
-          <w:rFonts w:ascii="Arial" w:hAnsi="Arial" w:eastAsia="Arial" w:cs="Arial"/>
-          <w:sz w:val="28"/>
-          <w:szCs w:val="28"/>
-        </w:rPr>
-        <w:t xml:space="preserve">É certo que houve consumo no imóvel após o falecimento da usuária originária. Todavia, a existência de consumo não permite concluir, por si só, quem efetivamente se beneficiou do serviço.</w:t>
+      </w:pPr>
+      <w:r>
+        <w:rPr>
+          <w:rFonts w:ascii="Arial" w:hAnsi="Arial" w:eastAsia="Arial" w:cs="Arial"/>
+          <w:sz w:val="28"/>
+          <w:szCs w:val="28"/>
+        </w:rPr>
+        <w:t xml:space="preserve">Todavia, </w:t>
+      </w:r>
+      <w:r>
+        <w:rPr>
+          <w:rFonts w:ascii="Arial" w:hAnsi="Arial" w:eastAsia="Arial" w:cs="Arial"/>
+          <w:color w:val="808080"/>
+          <w:sz w:val="28"/>
+          <w:szCs w:val="28"/>
+        </w:rPr>
+        <w:t xml:space="preserve">esses</w:t>
+      </w:r>
+      <w:r>
+        <w:rPr>
+          <w:rFonts w:ascii="Arial" w:hAnsi="Arial" w:eastAsia="Arial" w:cs="Arial"/>
+          <w:sz w:val="28"/>
+          <w:szCs w:val="28"/>
+        </w:rPr>
+        <w:t xml:space="preserve"> registros</w:t>
+      </w:r>
+      <w:r>
+        <w:rPr>
+          <w:rFonts w:ascii="Arial" w:hAnsi="Arial" w:eastAsia="Arial" w:cs="Arial"/>
+          <w:color w:val="808080"/>
+          <w:sz w:val="28"/>
+          <w:szCs w:val="28"/>
+        </w:rPr>
+        <w:t xml:space="preserve">,</w:t>
+      </w:r>
+      <w:r>
+        <w:rPr>
+          <w:rFonts w:ascii="Arial" w:hAnsi="Arial" w:eastAsia="Arial" w:cs="Arial"/>
+          <w:sz w:val="28"/>
+          <w:szCs w:val="28"/>
+        </w:rPr>
+        <w:t xml:space="preserve"> </w:t>
+      </w:r>
+      <w:r>
+        <w:rPr>
+          <w:rFonts w:ascii="Arial" w:hAnsi="Arial" w:eastAsia="Arial" w:cs="Arial"/>
+          <w:color w:val="808080"/>
+          <w:sz w:val="28"/>
+          <w:szCs w:val="28"/>
+        </w:rPr>
+        <w:t xml:space="preserve">produzidos</w:t>
+      </w:r>
+      <w:r>
+        <w:rPr>
+          <w:rFonts w:ascii="Arial" w:hAnsi="Arial" w:eastAsia="Arial" w:cs="Arial"/>
+          <w:sz w:val="28"/>
+          <w:szCs w:val="28"/>
+        </w:rPr>
+        <w:t xml:space="preserve"> </w:t>
+      </w:r>
+      <w:r>
+        <w:rPr>
+          <w:rFonts w:ascii="Arial" w:hAnsi="Arial" w:eastAsia="Arial" w:cs="Arial"/>
+          <w:color w:val="808080"/>
+          <w:sz w:val="28"/>
+          <w:szCs w:val="28"/>
+        </w:rPr>
+        <w:t xml:space="preserve">unilateralmente</w:t>
+      </w:r>
+      <w:r>
+        <w:rPr>
+          <w:rFonts w:ascii="Arial" w:hAnsi="Arial" w:eastAsia="Arial" w:cs="Arial"/>
+          <w:sz w:val="28"/>
+          <w:szCs w:val="28"/>
+        </w:rPr>
+        <w:t xml:space="preserve"> </w:t>
+      </w:r>
+      <w:r>
+        <w:rPr>
+          <w:rFonts w:ascii="Arial" w:hAnsi="Arial" w:eastAsia="Arial" w:cs="Arial"/>
+          <w:color w:val="808080"/>
+          <w:sz w:val="28"/>
+          <w:szCs w:val="28"/>
+        </w:rPr>
+        <w:t xml:space="preserve">pela</w:t>
+      </w:r>
+      <w:r>
+        <w:rPr>
+          <w:rFonts w:ascii="Arial" w:hAnsi="Arial" w:eastAsia="Arial" w:cs="Arial"/>
+          <w:sz w:val="28"/>
+          <w:szCs w:val="28"/>
+        </w:rPr>
+        <w:t xml:space="preserve"> </w:t>
+      </w:r>
+      <w:r>
+        <w:rPr>
+          <w:rFonts w:ascii="Arial" w:hAnsi="Arial" w:eastAsia="Arial" w:cs="Arial"/>
+          <w:color w:val="808080"/>
+          <w:sz w:val="28"/>
+          <w:szCs w:val="28"/>
+        </w:rPr>
+        <w:t xml:space="preserve">concessionária,</w:t>
+      </w:r>
+      <w:r>
+        <w:rPr>
+          <w:rFonts w:ascii="Arial" w:hAnsi="Arial" w:eastAsia="Arial" w:cs="Arial"/>
+          <w:sz w:val="28"/>
+          <w:szCs w:val="28"/>
+        </w:rPr>
+        <w:t xml:space="preserve"> </w:t>
+      </w:r>
+      <w:r>
+        <w:rPr>
+          <w:rFonts w:ascii="Arial" w:hAnsi="Arial" w:eastAsia="Arial" w:cs="Arial"/>
+          <w:color w:val="808080"/>
+          <w:sz w:val="28"/>
+          <w:szCs w:val="28"/>
+        </w:rPr>
+        <w:t xml:space="preserve">não</w:t>
+      </w:r>
+      <w:r>
+        <w:rPr>
+          <w:rFonts w:ascii="Arial" w:hAnsi="Arial" w:eastAsia="Arial" w:cs="Arial"/>
+          <w:sz w:val="28"/>
+          <w:szCs w:val="28"/>
+        </w:rPr>
+        <w:t xml:space="preserve"> </w:t>
+      </w:r>
+      <w:r>
+        <w:rPr>
+          <w:rFonts w:ascii="Arial" w:hAnsi="Arial" w:eastAsia="Arial" w:cs="Arial"/>
+          <w:color w:val="808080"/>
+          <w:sz w:val="28"/>
+          <w:szCs w:val="28"/>
+        </w:rPr>
+        <w:t xml:space="preserve">identificam quem formulou</w:t>
+      </w:r>
+      <w:r>
+        <w:rPr>
+          <w:rFonts w:ascii="Arial" w:hAnsi="Arial" w:eastAsia="Arial" w:cs="Arial"/>
+          <w:sz w:val="28"/>
+          <w:szCs w:val="28"/>
+        </w:rPr>
+        <w:t xml:space="preserve"> o </w:t>
+      </w:r>
+      <w:r>
+        <w:rPr>
+          <w:rFonts w:ascii="Arial" w:hAnsi="Arial" w:eastAsia="Arial" w:cs="Arial"/>
+          <w:color w:val="808080"/>
+          <w:sz w:val="28"/>
+          <w:szCs w:val="28"/>
+        </w:rPr>
+        <w:t xml:space="preserve">pedido</w:t>
+      </w:r>
+      <w:r>
+        <w:rPr>
+          <w:rFonts w:ascii="Arial" w:hAnsi="Arial" w:eastAsia="Arial" w:cs="Arial"/>
+          <w:sz w:val="28"/>
+          <w:szCs w:val="28"/>
+        </w:rPr>
+        <w:t xml:space="preserve"> e não comprovam, por si sós, que a apelante utilizava o serviço ou ocupava a unidade em dezembro de 2020, circunstância indispensável para legitimar a cobrança em seu desfavor.</w:t>
+      </w:r>
+      <w:commentRangeEnd w:id="16"/>
+      <w:r>
+        <w:rPr>
+          <w:rStyle w:val="CommentReference"/>
+        </w:rPr>
+        <w:commentReference w:id="16"/>
       </w:r>
     </w:p>
     <w:p>
@@ -6450,7 +7469,11 @@
         <w:spacing w:after="0" w:line="360" w:lineRule="auto"/>
         <w:ind w:firstLine="2268"/>
         <w:jc w:val="both"/>
-        <w:rPr/>
+        <w:rPr>
+          <w:rFonts w:ascii="Arial" w:hAnsi="Arial" w:eastAsia="Arial" w:cs="Arial"/>
+          <w:sz w:val="28"/>
+          <w:szCs w:val="28"/>
+        </w:rPr>
       </w:pPr>
     </w:p>
     <w:p>
@@ -6460,21 +7483,14 @@
         <w:jc w:val="both"/>
         <w:rPr/>
       </w:pPr>
-      <w:r>
-        <w:rPr>
-          <w:rFonts w:ascii="Arial" w:hAnsi="Arial" w:eastAsia="Arial" w:cs="Arial"/>
-          <w:sz w:val="28"/>
-          <w:szCs w:val="28"/>
-        </w:rPr>
-        <w:t xml:space="preserve">A cobrança não pode se amparar em mera presunção, sobretudo quando a</w:t>
-      </w:r>
-      <w:r>
-        <w:rPr>
-          <w:rFonts w:ascii="Arial" w:hAnsi="Arial" w:eastAsia="Arial" w:cs="Arial"/>
-          <w:sz w:val="28"/>
-          <w:szCs w:val="28"/>
-        </w:rPr>
-        <w:t xml:space="preserve"> ré não apresenta elementos concretos aptos a vincular a autora ao consumo faturado no período controvertido.</w:t>
+      <w:commentRangeStart w:id="17"/>
+      <w:r>
+        <w:rPr>
+          <w:rFonts w:ascii="Arial" w:hAnsi="Arial" w:eastAsia="Arial" w:cs="Arial"/>
+          <w:sz w:val="28"/>
+          <w:szCs w:val="28"/>
+        </w:rPr>
+        <w:t xml:space="preserve">É certo que houve consumo no imóvel após o falecimento da usuária originária. Todavia, a existência de consumo não permite concluir, por si só, quem efetivamente se beneficiou do serviço.</w:t>
       </w:r>
     </w:p>
     <w:p>
@@ -6495,18 +7511,18 @@
       <w:r>
         <w:rPr>
           <w:rFonts w:ascii="Arial" w:hAnsi="Arial" w:eastAsia="Arial" w:cs="Arial"/>
-          <w:color w:val="808080"/>
-          <w:sz w:val="28"/>
-          <w:szCs w:val="28"/>
-        </w:rPr>
-        <w:t xml:space="preserve">O art. 373, II, do CPC dispõe:</w:t>
-      </w:r>
-      <w:commentRangeEnd w:id="16"/>
-      <w:r>
-        <w:rPr>
-          <w:rStyle w:val="CommentReference"/>
-        </w:rPr>
-        <w:commentReference w:id="16"/>
+          <w:sz w:val="28"/>
+          <w:szCs w:val="28"/>
+        </w:rPr>
+        <w:t xml:space="preserve">A cobrança não pode se amparar em mera presunção, sobretudo quando a</w:t>
+      </w:r>
+      <w:r>
+        <w:rPr>
+          <w:rFonts w:ascii="Arial" w:hAnsi="Arial" w:eastAsia="Arial" w:cs="Arial"/>
+          <w:sz w:val="28"/>
+          <w:szCs w:val="28"/>
+        </w:rPr>
+        <w:t xml:space="preserve"> ré não apresenta elementos concretos aptos a vincular a autora ao consumo faturado no período controvertido.</w:t>
       </w:r>
     </w:p>
     <w:p>
@@ -6520,18 +7536,34 @@
     <w:p>
       <w:pPr>
         <w:spacing w:after="0" w:line="360" w:lineRule="auto"/>
-        <w:ind w:left="2268" w:firstLine="0"/>
+        <w:ind w:firstLine="2268"/>
         <w:jc w:val="both"/>
         <w:rPr/>
       </w:pPr>
       <w:r>
         <w:rPr>
-          <w:i/>
-          <w:color w:val="808080"/>
-          <w:sz w:val="26"/>
-        </w:rPr>
-        <w:t xml:space="preserve">“Art. 373. O ônus da prova incumbe:</w:t>
-      </w:r>
+          <w:rFonts w:ascii="Arial" w:hAnsi="Arial" w:eastAsia="Arial" w:cs="Arial"/>
+          <w:color w:val="808080"/>
+          <w:sz w:val="28"/>
+          <w:szCs w:val="28"/>
+        </w:rPr>
+        <w:t xml:space="preserve">O art. 373, II, do CPC dispõe:</w:t>
+      </w:r>
+      <w:commentRangeEnd w:id="17"/>
+      <w:r>
+        <w:rPr>
+          <w:rStyle w:val="CommentReference"/>
+        </w:rPr>
+        <w:commentReference w:id="17"/>
+      </w:r>
+    </w:p>
+    <w:p>
+      <w:pPr>
+        <w:spacing w:after="0" w:line="360" w:lineRule="auto"/>
+        <w:ind w:firstLine="2268"/>
+        <w:jc w:val="both"/>
+        <w:rPr/>
+      </w:pPr>
     </w:p>
     <w:p>
       <w:pPr>
@@ -6546,7 +7578,7 @@
           <w:color w:val="808080"/>
           <w:sz w:val="26"/>
         </w:rPr>
-        <w:t xml:space="preserve">(...)</w:t>
+        <w:t xml:space="preserve">“Art. 373. O ônus da prova incumbe:</w:t>
       </w:r>
     </w:p>
     <w:p>
@@ -6561,6 +7593,22 @@
           <w:i/>
           <w:color w:val="808080"/>
           <w:sz w:val="26"/>
+        </w:rPr>
+        <w:t xml:space="preserve">(...)</w:t>
+      </w:r>
+    </w:p>
+    <w:p>
+      <w:pPr>
+        <w:spacing w:after="0" w:line="360" w:lineRule="auto"/>
+        <w:ind w:left="2268" w:firstLine="0"/>
+        <w:jc w:val="both"/>
+        <w:rPr/>
+      </w:pPr>
+      <w:r>
+        <w:rPr>
+          <w:i/>
+          <w:color w:val="808080"/>
+          <w:sz w:val="26"/>
           <w:u w:val="single"/>
         </w:rPr>
         <w:t xml:space="preserve">II - ao réu, quanto à existência de fato impeditivo, modificativo ou extintivo do direito do autor.” – Grifei</w:t>
@@ -6696,7 +7744,7 @@
         <w:ind w:firstLine="2268"/>
         <w:jc w:val="both"/>
       </w:pPr>
-      <w:commentRangeStart w:id="17"/>
+      <w:commentRangeStart w:id="18"/>
       <w:r>
         <w:rPr>
           <w:rFonts w:ascii="Arial" w:hAnsi="Arial" w:eastAsia="Arial" w:cs="Arial"/>
@@ -6713,12 +7761,12 @@
         </w:rPr>
         <w:t xml:space="preserve">:</w:t>
       </w:r>
-      <w:commentRangeEnd w:id="17"/>
+      <w:commentRangeEnd w:id="18"/>
       <w:r>
         <w:rPr>
           <w:rStyle w:val="CommentReference"/>
         </w:rPr>
-        <w:commentReference w:id="17"/>
+        <w:commentReference w:id="18"/>
       </w:r>
     </w:p>
     <w:p>
@@ -7105,8 +8153,8 @@
         <w:jc w:val="both"/>
         <w:rPr/>
       </w:pPr>
-      <w:commentRangeStart w:id="18"/>
       <w:commentRangeStart w:id="19"/>
+      <w:commentRangeStart w:id="20"/>
       <w:r>
         <w:rPr>
           <w:rFonts w:ascii="Arial" w:hAnsi="Arial" w:cs="Arial"/>
@@ -7201,19 +8249,19 @@
         </w:rPr>
         <w:t xml:space="preserve">afastados os arbitrados em favor da ré (CPC 85 caput e 86 caput).</w:t>
       </w:r>
-      <w:commentRangeEnd w:id="18"/>
       <w:commentRangeEnd w:id="19"/>
+      <w:commentRangeEnd w:id="20"/>
       <w:r>
         <w:rPr>
           <w:rStyle w:val="CommentReference"/>
         </w:rPr>
-        <w:commentReference w:id="18"/>
+        <w:commentReference w:id="19"/>
       </w:r>
       <w:r>
         <w:rPr>
           <w:rStyle w:val="CommentReference"/>
         </w:rPr>
-        <w:commentReference w:id="19"/>
+        <w:commentReference w:id="20"/>
       </w:r>
     </w:p>
     <w:p>
@@ -8167,7 +9215,7 @@
       </w:r>
     </w:p>
   </w:comment>
-  <w:comment w:id="5" w:author="Assessor GDSXSR" w:initials="RG" w:date="2026-10-29T00:08:30Z">
+  <w:comment w:id="5" w:author="Assessor GDSXSR" w:initials="RG" w:date="2026-10-29T19:59:18Z">
     <w:p>
       <w:pPr>
         <w:pStyle w:val="CommentText"/>
@@ -8183,7 +9231,7 @@
       </w:r>
     </w:p>
   </w:comment>
-  <w:comment w:id="6" w:author="Assessor GDSXSR" w:initials="RG" w:date="2026-10-29T00:08:30Z">
+  <w:comment w:id="6" w:author="Assessor GDSXSR" w:initials="RG" w:date="2026-10-29T19:59:18Z">
     <w:p>
       <w:pPr>
         <w:pStyle w:val="CommentText"/>
@@ -8199,7 +9247,7 @@
       </w:r>
     </w:p>
   </w:comment>
-  <w:comment w:id="7" w:author="Assessor GDSXSR" w:initials="RG" w:date="2026-10-29T00:08:30Z">
+  <w:comment w:id="7" w:author="Assessor GDSXSR" w:initials="RG" w:date="2026-10-29T19:59:18Z">
     <w:p>
       <w:pPr>
         <w:pStyle w:val="CommentText"/>
@@ -8215,7 +9263,7 @@
       </w:r>
     </w:p>
   </w:comment>
-  <w:comment w:id="8" w:author="Assessor GDSXSR" w:initials="RG" w:date="2026-10-29T00:08:30Z">
+  <w:comment w:id="8" w:author="Assessor GDSXSR" w:initials="RG" w:date="2026-10-29T19:59:18Z">
     <w:p>
       <w:pPr>
         <w:pStyle w:val="CommentText"/>
@@ -8231,7 +9279,7 @@
       </w:r>
     </w:p>
   </w:comment>
-  <w:comment w:id="9" w:author="Assessor GDSXSR" w:initials="RG" w:date="2026-10-29T00:08:30Z">
+  <w:comment w:id="9" w:author="Assessor GDSXSR" w:initials="RG" w:date="2026-10-29T19:59:18Z">
     <w:p>
       <w:pPr>
         <w:pStyle w:val="CommentText"/>
@@ -8247,7 +9295,7 @@
       </w:r>
     </w:p>
   </w:comment>
-  <w:comment w:id="10" w:author="Assessor GDSXSR" w:initials="RG" w:date="2026-10-29T00:08:30Z">
+  <w:comment w:id="10" w:author="Assessor GDSXSR" w:initials="RG" w:date="2026-10-29T19:59:18Z">
     <w:p>
       <w:pPr>
         <w:pStyle w:val="CommentText"/>
@@ -8263,7 +9311,7 @@
       </w:r>
     </w:p>
   </w:comment>
-  <w:comment w:id="11" w:author="Assessor GDSXSR" w:initials="RG" w:date="2026-10-29T00:08:30Z">
+  <w:comment w:id="11" w:author="Assessor GDSXSR" w:initials="RG" w:date="2026-10-29T19:59:18Z">
     <w:p>
       <w:pPr>
         <w:pStyle w:val="CommentText"/>
@@ -8279,7 +9327,7 @@
       </w:r>
     </w:p>
   </w:comment>
-  <w:comment w:id="12" w:author="Assessor GDSXSR" w:initials="RG" w:date="2026-10-29T00:08:30Z">
+  <w:comment w:id="12" w:author="Assessor GDSXSR" w:initials="RG" w:date="2026-10-29T19:59:18Z">
     <w:p>
       <w:pPr>
         <w:pStyle w:val="CommentText"/>
@@ -8291,11 +9339,11 @@
         <w:annotationRef/>
       </w:r>
       <w:r>
-        <w:t>ASSESSOR GDSXSR — Pendência (C-52): o relatório enumera quatro alegações do apelo (inclusive o enriquecimento sem causa), e o voto enumera três (inclusive a jurisprudência do STJ). Sem o apelo (ID 89370589), mantive cada texto como veio; conferir se o enriquecimento sem causa, fundamento da sentença, é enfrentado no capítulo.</w:t>
+        <w:t>ASSESSOR GDSXSR — Conferido no apelo (ID 89370589): corrigi 'Apelo do autora' e ajustei as alegações 2 e 3 ao que o apelo diz (jurisprudência do TJSP e do STJ sobre a cobrança do espólio; enriquecimento sem causa seria da concessionária). O voto passou a enumerar as mesmas alegações do capítulo (C-30).</w:t>
       </w:r>
     </w:p>
   </w:comment>
-  <w:comment w:id="13" w:author="Assessor GDSXSR" w:initials="RG" w:date="2026-10-29T00:08:30Z">
+  <w:comment w:id="13" w:author="Assessor GDSXSR" w:initials="RG" w:date="2026-10-29T19:59:18Z">
     <w:p>
       <w:pPr>
         <w:pStyle w:val="CommentText"/>
@@ -8311,7 +9359,7 @@
       </w:r>
     </w:p>
   </w:comment>
-  <w:comment w:id="14" w:author="Assessor GDSXSR" w:initials="RG" w:date="2026-10-29T00:08:30Z">
+  <w:comment w:id="14" w:author="Assessor GDSXSR" w:initials="RG" w:date="2026-10-29T19:59:18Z">
     <w:p>
       <w:pPr>
         <w:pStyle w:val="CommentText"/>
@@ -8327,7 +9375,7 @@
       </w:r>
     </w:p>
   </w:comment>
-  <w:comment w:id="15" w:author="Assessor GDSXSR" w:initials="RG" w:date="2026-10-29T00:08:30Z">
+  <w:comment w:id="15" w:author="Assessor GDSXSR" w:initials="RG" w:date="2026-10-29T19:59:18Z">
     <w:p>
       <w:pPr>
         <w:pStyle w:val="CommentText"/>
@@ -8339,11 +9387,11 @@
         <w:annotationRef/>
       </w:r>
       <w:r>
-        <w:t>ASSESSOR GDSXSR — Pendência (C-52, C-24): o voto afirma que a apelante assumiu a posse em 11/4/2023 (Ofício nº 764/2024), mas o relatório da sentença registra que, segundo a inicial, ela 'permaneceu na posse do imóvel' após o óbito, e a sentença se apoia nisso para manter a fatura de dezembro de 2020. Sem os autos, mantive a premissa da minuta; conferir nos IDs 89370538, 89370541 e 89370549 e a frase 'Essa versão foi reiterada ao longo da demanda', que está sem ID. Movi os IDs para o fim dos períodos e troquei 'Além disso' por 'No mais' (C-20, C-23).</w:t>
+        <w:t>ASSESSOR GDSXSR — Conferido nos autos: o Ofício nº 764/2024 está no ID 89370538 e registra a posse em 11/04/2023; a autora reitera, na emenda (ID 89370536) e nos embargos (ID 89370541), que residia em outro imóvel (quadra 214, conjunto F, lote 10, adquirido em 13/07/2017) e que só tomou posse após a escritura. A escritura está no ID 89370528, e não no 89370541, que a minuta citava; corrigi (C-24). A sentença registra que a autora 'permaneceu na posse' após o óbito, mas não localizei essa afirmação em peça da autora; acrescentei a frase que contrapõe a premissa da sentença (C-3R). IDs levados ao fim dos períodos e 'Além disso' trocado por 'No mais' (C-20, C-23).</w:t>
       </w:r>
     </w:p>
   </w:comment>
-  <w:comment w:id="16" w:author="Assessor GDSXSR" w:initials="RG" w:date="2026-10-29T00:08:30Z">
+  <w:comment w:id="16" w:author="Assessor GDSXSR" w:initials="RG" w:date="2026-10-29T19:59:18Z">
     <w:p>
       <w:pPr>
         <w:pStyle w:val="CommentText"/>
@@ -8355,11 +9403,27 @@
         <w:annotationRef/>
       </w:r>
       <w:r>
+        <w:t>ASSESSOR GDSXSR — Pendência de resultado (C-53): a prova da CAESB é mais concreta do que a minuta dizia. A contestação (ID 89370549) traz tela cadastral com a autora vinculada à unidade em 10/12/2020 e a OS 2500100122055908, de 22/12/2020, em que 'o usuário' pediu revisão/distribuição da conta de 12/2020 (campo 'Demandante: CLIENTE', sem nome), além da afirmação de posse desde junho de 2020. Descrevi essa prova no texto e expliquei por que não basta; mantive o resultado. Se o Des. Sérgio entender que a OS e o cadastro bastam para provar o uso em dezembro de 2020, o capítulo muda de sentido; linha do Gabinete: modelo 0725583-34 (ônus da concessionária, CPC 373 II).</w:t>
+      </w:r>
+    </w:p>
+  </w:comment>
+  <w:comment w:id="17" w:author="Assessor GDSXSR" w:initials="RG" w:date="2026-10-29T19:59:18Z">
+    <w:p>
+      <w:pPr>
+        <w:pStyle w:val="CommentText"/>
+      </w:pPr>
+      <w:r>
+        <w:rPr>
+          <w:rStyle w:val="CommentReference"/>
+        </w:rPr>
+        <w:annotationRef/>
+      </w:r>
+      <w:r>
         <w:t>ASSESSOR GDSXSR — Inseri a transcrição do CPC 373 II, norma que sustenta o capítulo (C-66 a), conferida no Planalto pelo iajus, e passei o período sobre o ônus da prova para a forma compacta (C-20). Cisão em períodos (C-11).</w:t>
       </w:r>
     </w:p>
   </w:comment>
-  <w:comment w:id="17" w:author="Assessor GDSXSR" w:initials="RG" w:date="2026-10-29T00:08:30Z">
+  <w:comment w:id="18" w:author="Assessor GDSXSR" w:initials="RG" w:date="2026-10-29T19:59:18Z">
     <w:p>
       <w:pPr>
         <w:pStyle w:val="CommentText"/>
@@ -8375,7 +9439,7 @@
       </w:r>
     </w:p>
   </w:comment>
-  <w:comment w:id="18" w:author="Assessor GDSXSR" w:initials="RG" w:date="2026-10-29T00:08:30Z">
+  <w:comment w:id="19" w:author="Assessor GDSXSR" w:initials="RG" w:date="2026-10-29T19:59:18Z">
     <w:p>
       <w:pPr>
         <w:pStyle w:val="CommentText"/>
@@ -8391,7 +9455,7 @@
       </w:r>
     </w:p>
   </w:comment>
-  <w:comment w:id="19" w:author="Assessor GDSXSR" w:initials="RG" w:date="2026-10-29T00:08:30Z">
+  <w:comment w:id="20" w:author="Assessor GDSXSR" w:initials="RG" w:date="2026-10-29T19:59:18Z">
     <w:p>
       <w:pPr>
         <w:pStyle w:val="CommentText"/>
@@ -8403,7 +9467,7 @@
         <w:annotationRef/>
       </w:r>
       <w:r>
-        <w:t>ASSESSOR GDSXSR — Honorários (C-51): a minuta mandava manter 'os parâmetros' da sentença, o que incluiria os R$ 300,00 da ré, incompatíveis com o provimento. Explicitei que subsistem os R$ 1.000,00 fixados em favor da autora e que saem os arbitrados à ré. Texto da sentença (ID 89370577): “Fixo, em favor da parte autora, honorários advocatícios de sucumbência, (...) arbitro por equidade em R$ 1.000,00 (mil reais), com fundamento no art. 85, § 8º, do Código de Processo Civil.” e “Fixo, em favor da parte requerida, honorários advocatícios de sucumbência, também por equidade, no valor de R$ 300,00 (trezentos reais) (...)”. Acrescentei 'Sem honorários recursais', pois o apelo foi provido (padrão do perfil APC, item 7).</w:t>
+        <w:t>ASSESSOR GDSXSR — Honorários (C-51): a minuta mandava manter 'os parâmetros' da sentença, o que incluiria os R$ 300,00 da ré, incompatíveis com o provimento. Explicitei que subsistem os R$ 1.000,00 fixados em favor da autora e que saem os arbitrados à ré. Texto da sentença (ID 89370577): “Fixo, em favor da parte autora, honorários advocatícios de sucumbência, (...) arbitro por equidade em R$ 1.000,00 (mil reais), com fundamento no art. 85, § 8º, do Código de Processo Civil.” e “Fixo, em favor da parte requerida, honorários advocatícios de sucumbência, também por equidade, no valor de R$ 300,00 (trezentos reais) (...)”. Acrescentei 'Sem honorários recursais': o apelo pediu a majoração em grau recursal (ID 89370589), mas foi provido e não há recorrente vencido (padrão do perfil APC, item 7).</w:t>
       </w:r>
     </w:p>
   </w:comment>

</xml_diff>